<commit_message>
docs: PRO-SG-010, quantité minimum formulée d'après le texte du contrat
La formulation précédente présentait 90 kg comme un seuil absolu. Le
contrat définit une quantité minimum de trois bacs pleins de 30 kg ou
d'un fût plein de 300 kg : le seuil dépend donc du contenant mis à
disposition. Le paragraphe I n'interdit pas l'enlèvement en dessous, il
le conditionne à un accord séparé sur l'organisation et la fréquence.

Co-Authored-By: Claude Opus 5 <noreply@anthropic.com>
Claude-Session: https://claude.ai/code/session_015f3bXvDt4ZWz22riASrzWJ
</commit_message>
<xml_diff>
--- a/procedure-lyreco/PRO-SG-010_Collecte_des_piles.docx
+++ b/procedure-lyreco/PRO-SG-010_Collecte_des_piles.docx
@@ -461,7 +461,7 @@
                 <w:sz w:val="17"/>
                 <w:szCs w:val="17"/>
               </w:rPr>
-              <w:t xml:space="preserve">L'enlèvement n'est déclenché qu'à partir de </w:t>
+              <w:t xml:space="preserve">Le contrat fixe une </w:t>
             </w:r>
             <w:r>
               <w:rPr>
@@ -472,16 +472,16 @@
                 <w:sz w:val="17"/>
                 <w:szCs w:val="17"/>
               </w:rPr>
-              <w:t xml:space="preserve">90 kg</w:t>
-            </w:r>
-            <w:r>
-              <w:rPr>
-                <w:rFonts w:ascii="Cambria" w:cs="Cambria" w:eastAsia="Cambria" w:hAnsi="Cambria"/>
-                <w:color w:val="17232A"/>
-                <w:sz w:val="17"/>
-                <w:szCs w:val="17"/>
-              </w:rPr>
-              <w:t xml:space="preserve">, soit trois bacs pleins. Un centre qui produit une dizaine de kilos de piles boutons par an ne les atteindra pas : dans ce cas, demander plutôt un </w:t>
+              <w:t xml:space="preserve">quantité minimum</w:t>
+            </w:r>
+            <w:r>
+              <w:rPr>
+                <w:rFonts w:ascii="Cambria" w:cs="Cambria" w:eastAsia="Cambria" w:hAnsi="Cambria"/>
+                <w:color w:val="17232A"/>
+                <w:sz w:val="17"/>
+                <w:szCs w:val="17"/>
+              </w:rPr>
+              <w:t xml:space="preserve"> d'enlèvement : trois bacs pleins de 30 kg, soit </w:t>
             </w:r>
             <w:r>
               <w:rPr>
@@ -492,6 +492,46 @@
                 <w:sz w:val="17"/>
                 <w:szCs w:val="17"/>
               </w:rPr>
+              <w:t xml:space="preserve">90 kg</w:t>
+            </w:r>
+            <w:r>
+              <w:rPr>
+                <w:rFonts w:ascii="Cambria" w:cs="Cambria" w:eastAsia="Cambria" w:hAnsi="Cambria"/>
+                <w:color w:val="17232A"/>
+                <w:sz w:val="17"/>
+                <w:szCs w:val="17"/>
+              </w:rPr>
+              <w:t xml:space="preserve">, ou un fût plein de </w:t>
+            </w:r>
+            <w:r>
+              <w:rPr>
+                <w:rFonts w:ascii="Cambria" w:cs="Cambria" w:eastAsia="Cambria" w:hAnsi="Cambria"/>
+                <w:b/>
+                <w:bCs/>
+                <w:color w:val="17232A"/>
+                <w:sz w:val="17"/>
+                <w:szCs w:val="17"/>
+              </w:rPr>
+              <w:t xml:space="preserve">300 kg</w:t>
+            </w:r>
+            <w:r>
+              <w:rPr>
+                <w:rFonts w:ascii="Cambria" w:cs="Cambria" w:eastAsia="Cambria" w:hAnsi="Cambria"/>
+                <w:color w:val="17232A"/>
+                <w:sz w:val="17"/>
+                <w:szCs w:val="17"/>
+              </w:rPr>
+              <w:t xml:space="preserve">. En dessous, ecosystem n'est pas tenu d'intervenir ; un enlèvement reste possible, mais suppose un accord séparé sur l'organisation et la fréquence. Un centre qui produit une dizaine de kilos par an est donc dans une zone où rien n'est garanti : lui convient mieux un </w:t>
+            </w:r>
+            <w:r>
+              <w:rPr>
+                <w:rFonts w:ascii="Cambria" w:cs="Cambria" w:eastAsia="Cambria" w:hAnsi="Cambria"/>
+                <w:b/>
+                <w:bCs/>
+                <w:color w:val="17232A"/>
+                <w:sz w:val="17"/>
+                <w:szCs w:val="17"/>
+              </w:rPr>
               <w:t xml:space="preserve">bac de pré-collecte gratuit</w:t>
             </w:r>
             <w:r>
@@ -501,7 +541,7 @@
                 <w:sz w:val="17"/>
                 <w:szCs w:val="17"/>
               </w:rPr>
-              <w:t xml:space="preserve"> que le centre vide lui-même dans un point de collecte public. La démarche ci-dessous vaut pour un site qui </w:t>
+              <w:t xml:space="preserve">, vidé par le centre dans un point de collecte public. La démarche ci-dessous vaut pour un site qui </w:t>
             </w:r>
             <w:r>
               <w:rPr>
@@ -2336,7 +2376,7 @@
           <w:sz w:val="18"/>
           <w:szCs w:val="18"/>
         </w:rPr>
-        <w:t xml:space="preserve"> est atteinte : trois bacs pleins de 30 kg, ou un fût plein de 300 kg.</w:t>
+        <w:t xml:space="preserve"> est atteinte : trois bacs pleins de 30 kg, soit 90 kg, ou un fût plein de 300 kg selon le contenant mis à disposition.</w:t>
       </w:r>
     </w:p>
     <w:p>
@@ -2835,7 +2875,7 @@
                 <w:sz w:val="17"/>
                 <w:szCs w:val="17"/>
               </w:rPr>
-              <w:t xml:space="preserve">Le contenant est plein mais sous 90 kg</w:t>
+              <w:t xml:space="preserve">Contenant plein, quantité minimum non atteinte</w:t>
             </w:r>
           </w:p>
         </w:tc>
@@ -2862,7 +2902,7 @@
                 <w:sz w:val="17"/>
                 <w:szCs w:val="17"/>
               </w:rPr>
-              <w:t xml:space="preserve">Pas d'enlèvement de droit ; demander à ecosystem un accord d'organisation particulier</w:t>
+              <w:t xml:space="preserve">Pas d'enlèvement de droit : demander à ecosystem un accord séparé, ou une tournée à fréquence convenue</w:t>
             </w:r>
           </w:p>
         </w:tc>

</xml_diff>